<commit_message>
CV: full author lists, volume/pages, new 2026 papers, email-only header
Co-Authored-By: Claude Sonnet 5.5 <noreply@anthropic.com>
Claude-Session: https://claude.ai/code/session_0141pqnmFCsj6F5rmPp8p8TW
</commit_message>
<xml_diff>
--- a/media/Carasso_Shaqed_CV_2026.docx
+++ b/media/Carasso_Shaqed_CV_2026.docx
@@ -41,7 +41,7 @@
           <w:i w:val="0"/>
           <w:sz w:val="19"/>
         </w:rPr>
-        <w:t>scarasso@broadinstitute.org  ·  shaqasso.github.io  ·  linkedin.com/in/shaqed-carasso  ·  Google Scholar</w:t>
+        <w:t>scarasso@broadinstitute.org</w:t>
       </w:r>
     </w:p>
     <w:p>
@@ -69,23 +69,7 @@
           <w:i w:val="0"/>
           <w:sz w:val="20"/>
         </w:rPr>
-        <w:t xml:space="preserve">Computational and experimental microbiologist studying how gut bacteria, bacteriophages and the host interact. My PhD showed that reversible </w:t>
-      </w:r>
-      <w:r>
-        <w:rPr>
-          <w:b/>
-          <w:i w:val="0"/>
-          <w:sz w:val="20"/>
-        </w:rPr>
-        <w:t>DNA inversions (phase variation)</w:t>
-      </w:r>
-      <w:r>
-        <w:rPr>
-          <w:b w:val="0"/>
-          <w:i w:val="0"/>
-          <w:sz w:val="20"/>
-        </w:rPr>
-        <w:t xml:space="preserve"> in </w:t>
+        <w:t xml:space="preserve">I study how gut bacteria, their bacteriophages and the human host shape one another, combining metagenomic and genomic analysis with in vitro and mouse-model experiments. My PhD showed that reversible DNA inversions (phase variation) in </w:t>
       </w:r>
       <w:r>
         <w:rPr>
@@ -101,55 +85,7 @@
           <w:i w:val="0"/>
           <w:sz w:val="20"/>
         </w:rPr>
-        <w:t xml:space="preserve"> reshape bacterial function, immune modulation and long-term phage co-existence (</w:t>
-      </w:r>
-      <w:r>
-        <w:rPr>
-          <w:b w:val="0"/>
-          <w:i/>
-          <w:sz w:val="20"/>
-        </w:rPr>
-        <w:t>Cell Host &amp; Microbe</w:t>
-      </w:r>
-      <w:r>
-        <w:rPr>
-          <w:b w:val="0"/>
-          <w:i w:val="0"/>
-          <w:sz w:val="20"/>
-        </w:rPr>
-        <w:t xml:space="preserve">, </w:t>
-      </w:r>
-      <w:r>
-        <w:rPr>
-          <w:b w:val="0"/>
-          <w:i/>
-          <w:sz w:val="20"/>
-        </w:rPr>
-        <w:t>Gut Microbes</w:t>
-      </w:r>
-      <w:r>
-        <w:rPr>
-          <w:b w:val="0"/>
-          <w:i w:val="0"/>
-          <w:sz w:val="20"/>
-        </w:rPr>
-        <w:t xml:space="preserve">, </w:t>
-      </w:r>
-      <w:r>
-        <w:rPr>
-          <w:b w:val="0"/>
-          <w:i/>
-          <w:sz w:val="20"/>
-        </w:rPr>
-        <w:t>Nature Communications</w:t>
-      </w:r>
-      <w:r>
-        <w:rPr>
-          <w:b w:val="0"/>
-          <w:i w:val="0"/>
-          <w:sz w:val="20"/>
-        </w:rPr>
-        <w:t>). Now extending this work to microbe–host interactions at the Broad Institute.</w:t>
+        <w:t xml:space="preserve"> reshape bacterial function, immune modulation and long-term phage co-existence, in work published in Cell Host &amp; Microbe, Gut Microbes and Nature Communications. At the Broad Institute I am extending this work from microbe–phage dynamics to microbe–host interactions. I have authored 17 peer-reviewed articles, 9 of them as first or co-first author.</w:t>
       </w:r>
     </w:p>
     <w:p>
@@ -224,7 +160,7 @@
                 <w:color w:val="555555"/>
                 <w:sz w:val="19"/>
               </w:rPr>
-              <w:t>2021 – 2025</w:t>
+              <w:t>2021–2025</w:t>
             </w:r>
           </w:p>
         </w:tc>
@@ -250,16 +186,6 @@
             </w:r>
           </w:p>
           <w:p>
-            <w:r>
-              <w:rPr>
-                <w:b w:val="0"/>
-                <w:i w:val="0"/>
-                <w:sz w:val="19"/>
-              </w:rPr>
-              <w:t>Thesis: Phase Variations of the Bacteroides Genus</w:t>
-            </w:r>
-          </w:p>
-          <w:p>
             <w:pPr>
               <w:spacing w:after="60"/>
             </w:pPr>
@@ -269,7 +195,23 @@
                 <w:i w:val="0"/>
                 <w:sz w:val="19"/>
               </w:rPr>
-              <w:t>Advisors: Assoc. Prof. Naama Geva-Zatorsky (Technion); Dr. Itai Sharon (MIGAL Galilee Research Institute)</w:t>
+              <w:t xml:space="preserve">Thesis: </w:t>
+            </w:r>
+            <w:r>
+              <w:rPr>
+                <w:b w:val="0"/>
+                <w:i/>
+                <w:sz w:val="19"/>
+              </w:rPr>
+              <w:t>Phase Variations of the Bacteroides Genus</w:t>
+            </w:r>
+            <w:r>
+              <w:rPr>
+                <w:b w:val="0"/>
+                <w:i w:val="0"/>
+                <w:sz w:val="19"/>
+              </w:rPr>
+              <w:t>. Advisors: Assoc. Prof. Naama Geva-Zatorsky (Technion) and Dr. Itai Sharon (MIGAL Galilee Research Institute).</w:t>
             </w:r>
           </w:p>
         </w:tc>
@@ -301,7 +243,7 @@
                 <w:color w:val="555555"/>
                 <w:sz w:val="19"/>
               </w:rPr>
-              <w:t>2018 – 2021</w:t>
+              <w:t>2018–2021</w:t>
             </w:r>
           </w:p>
         </w:tc>
@@ -315,7 +257,7 @@
                 <w:b/>
                 <w:i w:val="0"/>
               </w:rPr>
-              <w:t>M.Sc., Medical Sciences (Cum Laude)</w:t>
+              <w:t>M.Sc., Medical Sciences (cum laude)</w:t>
             </w:r>
             <w:r>
               <w:rPr>
@@ -324,16 +266,6 @@
                 <w:color w:val="555555"/>
               </w:rPr>
               <w:t xml:space="preserve"> · Technion</w:t>
-            </w:r>
-          </w:p>
-          <w:p>
-            <w:r>
-              <w:rPr>
-                <w:b w:val="0"/>
-                <w:i w:val="0"/>
-                <w:sz w:val="19"/>
-              </w:rPr>
-              <w:t>Thesis: Fecal Microbiota Transplantation and Phage Therapy to Eradicate Antibiotic-Resistant Bacteria</w:t>
             </w:r>
           </w:p>
           <w:p>
@@ -346,7 +278,23 @@
                 <w:i w:val="0"/>
                 <w:sz w:val="19"/>
               </w:rPr>
-              <w:t>Advisor: Assoc. Prof. Naama Geva-Zatorsky</w:t>
+              <w:t xml:space="preserve">Thesis: </w:t>
+            </w:r>
+            <w:r>
+              <w:rPr>
+                <w:b w:val="0"/>
+                <w:i/>
+                <w:sz w:val="19"/>
+              </w:rPr>
+              <w:t>Fecal Microbiota Transplantation and Phage Therapy to Eradicate Antibiotic-Resistant Bacteria</w:t>
+            </w:r>
+            <w:r>
+              <w:rPr>
+                <w:b w:val="0"/>
+                <w:i w:val="0"/>
+                <w:sz w:val="19"/>
+              </w:rPr>
+              <w:t>. Advisor: Assoc. Prof. Naama Geva-Zatorsky.</w:t>
             </w:r>
           </w:p>
         </w:tc>
@@ -378,7 +326,7 @@
                 <w:color w:val="555555"/>
                 <w:sz w:val="19"/>
               </w:rPr>
-              <w:t>2014 – 2018</w:t>
+              <w:t>2014–2018</w:t>
             </w:r>
           </w:p>
         </w:tc>
@@ -453,7 +401,7 @@
                 <w:color w:val="555555"/>
                 <w:sz w:val="19"/>
               </w:rPr>
-              <w:t>08/2025 – present</w:t>
+              <w:t>08/2025–present</w:t>
             </w:r>
           </w:p>
         </w:tc>
@@ -488,7 +436,7 @@
                 <w:i w:val="0"/>
                 <w:sz w:val="19"/>
               </w:rPr>
-              <w:t>Advisor: Prof. Ramnik Xavier</w:t>
+              <w:t>Advisor: Prof. Ramnik Xavier.</w:t>
             </w:r>
           </w:p>
         </w:tc>
@@ -520,74 +468,7 @@
                 <w:color w:val="555555"/>
                 <w:sz w:val="19"/>
               </w:rPr>
-              <w:t>2018 – 2025</w:t>
-            </w:r>
-          </w:p>
-        </w:tc>
-        <w:tc>
-          <w:tcPr>
-            <w:tcW w:type="dxa" w:w="8277"/>
-          </w:tcPr>
-          <w:p>
-            <w:r>
-              <w:rPr>
-                <w:b/>
-                <w:i w:val="0"/>
-              </w:rPr>
-              <w:t>Graduate Researcher</w:t>
-            </w:r>
-            <w:r>
-              <w:rPr>
-                <w:b w:val="0"/>
-                <w:i w:val="0"/>
-                <w:color w:val="555555"/>
-              </w:rPr>
-              <w:t xml:space="preserve"> · Technion, Haifa</w:t>
-            </w:r>
-          </w:p>
-          <w:p>
-            <w:pPr>
-              <w:spacing w:after="60"/>
-            </w:pPr>
-            <w:r>
-              <w:rPr>
-                <w:b w:val="0"/>
-                <w:i w:val="0"/>
-                <w:sz w:val="19"/>
-              </w:rPr>
-              <w:t>Geva-Zatorsky Lab, Technion (M.Sc. and Ph.D.)</w:t>
-            </w:r>
-          </w:p>
-        </w:tc>
-      </w:tr>
-    </w:tbl>
-    <w:tbl>
-      <w:tblPr>
-        <w:tblW w:type="auto" w:w="0"/>
-        <w:tblLayout w:type="fixed"/>
-        <w:tblLook w:firstColumn="1" w:firstRow="1" w:lastColumn="0" w:lastRow="0" w:noHBand="0" w:noVBand="1" w:val="04A0"/>
-      </w:tblPr>
-      <w:tblGrid>
-        <w:gridCol w:w="1871"/>
-        <w:gridCol w:w="8277"/>
-      </w:tblGrid>
-      <w:tr>
-        <w:trPr>
-          <w:cantSplit/>
-        </w:trPr>
-        <w:tc>
-          <w:tcPr>
-            <w:tcW w:type="dxa" w:w="1871"/>
-          </w:tcPr>
-          <w:p>
-            <w:r>
-              <w:rPr>
-                <w:b w:val="0"/>
-                <w:i w:val="0"/>
-                <w:color w:val="555555"/>
-                <w:sz w:val="19"/>
-              </w:rPr>
-              <w:t>10/2021 – 03/2025</w:t>
+              <w:t>10/2021–03/2025</w:t>
             </w:r>
           </w:p>
         </w:tc>
@@ -609,7 +490,7 @@
                 <w:i w:val="0"/>
                 <w:color w:val="555555"/>
               </w:rPr>
-              <w:t xml:space="preserve"> · Technion, Haifa</w:t>
+              <w:t xml:space="preserve"> · Medical Bacteriology Laboratory, Technion, Haifa</w:t>
             </w:r>
           </w:p>
           <w:p>
@@ -622,7 +503,7 @@
                 <w:i w:val="0"/>
                 <w:sz w:val="19"/>
               </w:rPr>
-              <w:t>Medical Bacteriology Laboratory, undergraduate medical school course</w:t>
+              <w:t>Undergraduate medical school course.</w:t>
             </w:r>
           </w:p>
         </w:tc>
@@ -658,7 +539,7 @@
           <w:color w:val="555555"/>
           <w:sz w:val="19"/>
         </w:rPr>
-        <w:t>Journal articles   († equal contribution)</w:t>
+        <w:t>Phase variation, phages and microbe–host interactions</w:t>
       </w:r>
     </w:p>
     <w:p>
@@ -676,7 +557,1045 @@
           <w:color w:val="555555"/>
           <w:sz w:val="19"/>
         </w:rPr>
-        <w:t>14.</w:t>
+        <w:t>1.</w:t>
+        <w:tab/>
+      </w:r>
+      <w:r>
+        <w:rPr>
+          <w:b/>
+          <w:i w:val="0"/>
+          <w:sz w:val="19"/>
+        </w:rPr>
+        <w:t>Carasso S</w:t>
+      </w:r>
+      <w:r>
+        <w:rPr>
+          <w:b w:val="0"/>
+          <w:i w:val="0"/>
+          <w:sz w:val="19"/>
+        </w:rPr>
+        <w:t xml:space="preserve">, Kasher-Dvora M, Gefen T, Geva-Zatorsky N. Phase variation-mediated bacterial functional plasticity as a lens for understanding microbe–host interactions. </w:t>
+      </w:r>
+      <w:r>
+        <w:rPr>
+          <w:b w:val="0"/>
+          <w:i/>
+          <w:sz w:val="19"/>
+        </w:rPr>
+        <w:t>Gut Microbes.</w:t>
+      </w:r>
+      <w:r>
+        <w:rPr>
+          <w:b w:val="0"/>
+          <w:i w:val="0"/>
+          <w:sz w:val="19"/>
+        </w:rPr>
+        <w:t xml:space="preserve"> 2026;18(1):2687913.</w:t>
+      </w:r>
+    </w:p>
+    <w:p>
+      <w:pPr>
+        <w:tabs>
+          <w:tab w:pos="510" w:val="left"/>
+        </w:tabs>
+        <w:spacing w:after="60"/>
+        <w:ind w:left="510" w:hanging="510"/>
+      </w:pPr>
+      <w:r>
+        <w:rPr>
+          <w:b w:val="0"/>
+          <w:i w:val="0"/>
+          <w:color w:val="555555"/>
+          <w:sz w:val="19"/>
+        </w:rPr>
+        <w:t>2.</w:t>
+        <w:tab/>
+      </w:r>
+      <w:r>
+        <w:rPr>
+          <w:b w:val="0"/>
+          <w:i w:val="0"/>
+          <w:sz w:val="19"/>
+        </w:rPr>
+        <w:t xml:space="preserve">Gal-Mandelbaum N, </w:t>
+      </w:r>
+      <w:r>
+        <w:rPr>
+          <w:b/>
+          <w:i w:val="0"/>
+          <w:sz w:val="19"/>
+        </w:rPr>
+        <w:t>Carasso S</w:t>
+      </w:r>
+      <w:r>
+        <w:rPr>
+          <w:b w:val="0"/>
+          <w:i w:val="0"/>
+          <w:sz w:val="19"/>
+        </w:rPr>
+        <w:t xml:space="preserve">, Kedem A, Ziv T, Keshet-David R, Abboud R, Zaatry R, Gefen T, Geva-Zatorsky N. Dietary carbohydrates alter immune-modulatory functionalities and DNA inversions in </w:t>
+      </w:r>
+      <w:r>
+        <w:rPr>
+          <w:b w:val="0"/>
+          <w:i/>
+          <w:sz w:val="19"/>
+        </w:rPr>
+        <w:t>Bacteroides thetaiotaomicron</w:t>
+      </w:r>
+      <w:r>
+        <w:rPr>
+          <w:b w:val="0"/>
+          <w:i w:val="0"/>
+          <w:sz w:val="19"/>
+        </w:rPr>
+        <w:t xml:space="preserve">. </w:t>
+      </w:r>
+      <w:r>
+        <w:rPr>
+          <w:b w:val="0"/>
+          <w:i/>
+          <w:sz w:val="19"/>
+        </w:rPr>
+        <w:t>Nat Commun.</w:t>
+      </w:r>
+      <w:r>
+        <w:rPr>
+          <w:b w:val="0"/>
+          <w:i w:val="0"/>
+          <w:sz w:val="19"/>
+        </w:rPr>
+        <w:t xml:space="preserve"> 2025;16:4938.</w:t>
+      </w:r>
+    </w:p>
+    <w:p>
+      <w:pPr>
+        <w:tabs>
+          <w:tab w:pos="510" w:val="left"/>
+        </w:tabs>
+        <w:spacing w:after="60"/>
+        <w:ind w:left="510" w:hanging="510"/>
+      </w:pPr>
+      <w:r>
+        <w:rPr>
+          <w:b w:val="0"/>
+          <w:i w:val="0"/>
+          <w:color w:val="555555"/>
+          <w:sz w:val="19"/>
+        </w:rPr>
+        <w:t>3.</w:t>
+        <w:tab/>
+      </w:r>
+      <w:r>
+        <w:rPr>
+          <w:b w:val="0"/>
+          <w:i w:val="0"/>
+          <w:sz w:val="19"/>
+        </w:rPr>
+        <w:t>†</w:t>
+      </w:r>
+      <w:r>
+        <w:rPr>
+          <w:b/>
+          <w:i w:val="0"/>
+          <w:sz w:val="19"/>
+        </w:rPr>
+        <w:t>Carasso S</w:t>
+      </w:r>
+      <w:r>
+        <w:rPr>
+          <w:b w:val="0"/>
+          <w:i w:val="0"/>
+          <w:sz w:val="19"/>
+        </w:rPr>
+        <w:t xml:space="preserve">, †Keshet-David R, Zhang J, Hajjo H, Kadosh-Kariti D, Gefen T, Geva-Zatorsky N. Bacteriophage-driven DNA inversions shape bacterial functionality and long-term co-existence in </w:t>
+      </w:r>
+      <w:r>
+        <w:rPr>
+          <w:b w:val="0"/>
+          <w:i/>
+          <w:sz w:val="19"/>
+        </w:rPr>
+        <w:t>Bacteroides fragilis</w:t>
+      </w:r>
+      <w:r>
+        <w:rPr>
+          <w:b w:val="0"/>
+          <w:i w:val="0"/>
+          <w:sz w:val="19"/>
+        </w:rPr>
+        <w:t xml:space="preserve">. </w:t>
+      </w:r>
+      <w:r>
+        <w:rPr>
+          <w:b w:val="0"/>
+          <w:i/>
+          <w:sz w:val="19"/>
+        </w:rPr>
+        <w:t>Gut Microbes.</w:t>
+      </w:r>
+      <w:r>
+        <w:rPr>
+          <w:b w:val="0"/>
+          <w:i w:val="0"/>
+          <w:sz w:val="19"/>
+        </w:rPr>
+        <w:t xml:space="preserve"> 2025;17(1):2501492.</w:t>
+      </w:r>
+    </w:p>
+    <w:p>
+      <w:pPr>
+        <w:tabs>
+          <w:tab w:pos="510" w:val="left"/>
+        </w:tabs>
+        <w:spacing w:after="60"/>
+        <w:ind w:left="510" w:hanging="510"/>
+      </w:pPr>
+      <w:r>
+        <w:rPr>
+          <w:b w:val="0"/>
+          <w:i w:val="0"/>
+          <w:color w:val="555555"/>
+          <w:sz w:val="19"/>
+        </w:rPr>
+        <w:t>4.</w:t>
+        <w:tab/>
+      </w:r>
+      <w:r>
+        <w:rPr>
+          <w:b w:val="0"/>
+          <w:i w:val="0"/>
+          <w:sz w:val="19"/>
+        </w:rPr>
+        <w:t>†</w:t>
+      </w:r>
+      <w:r>
+        <w:rPr>
+          <w:b/>
+          <w:i w:val="0"/>
+          <w:sz w:val="19"/>
+        </w:rPr>
+        <w:t>Carasso S</w:t>
+      </w:r>
+      <w:r>
+        <w:rPr>
+          <w:b w:val="0"/>
+          <w:i w:val="0"/>
+          <w:sz w:val="19"/>
+        </w:rPr>
+        <w:t xml:space="preserve">, †Zaatry R, †Hajjo H, †Kadosh-Kariti D, Ben-Assa N, Naddaf R, Mandelbaum N, Pressman S, Chowers Y, Gefen T, Jeffrey KL, Jofre J, Coyne MJ, Comstock LE, Sharon I, Geva-Zatorsky N. Inflammation and bacteriophages affect DNA inversion states and functionality of the gut microbiota. </w:t>
+      </w:r>
+      <w:r>
+        <w:rPr>
+          <w:b w:val="0"/>
+          <w:i/>
+          <w:sz w:val="19"/>
+        </w:rPr>
+        <w:t>Cell Host Microbe.</w:t>
+      </w:r>
+      <w:r>
+        <w:rPr>
+          <w:b w:val="0"/>
+          <w:i w:val="0"/>
+          <w:sz w:val="19"/>
+        </w:rPr>
+        <w:t xml:space="preserve"> 2024;32(3):322–334.e9.</w:t>
+      </w:r>
+    </w:p>
+    <w:p>
+      <w:pPr>
+        <w:tabs>
+          <w:tab w:pos="510" w:val="left"/>
+        </w:tabs>
+        <w:spacing w:after="60"/>
+        <w:ind w:left="510" w:hanging="510"/>
+      </w:pPr>
+      <w:r>
+        <w:rPr>
+          <w:b w:val="0"/>
+          <w:i w:val="0"/>
+          <w:color w:val="555555"/>
+          <w:sz w:val="19"/>
+        </w:rPr>
+        <w:t>5.</w:t>
+        <w:tab/>
+      </w:r>
+      <w:r>
+        <w:rPr>
+          <w:b w:val="0"/>
+          <w:i w:val="0"/>
+          <w:sz w:val="19"/>
+        </w:rPr>
+        <w:t xml:space="preserve">Mandelbaum N, Zhang L, </w:t>
+      </w:r>
+      <w:r>
+        <w:rPr>
+          <w:b/>
+          <w:i w:val="0"/>
+          <w:sz w:val="19"/>
+        </w:rPr>
+        <w:t>Carasso S</w:t>
+      </w:r>
+      <w:r>
+        <w:rPr>
+          <w:b w:val="0"/>
+          <w:i w:val="0"/>
+          <w:sz w:val="19"/>
+        </w:rPr>
+        <w:t xml:space="preserve">, Ziv T, Lifshiz-Simon S, Davidovich I, Luz I, Berinstein E, Gefen T, Cooks T, Talmon Y, Balskus EP, Geva-Zatorsky N. Extracellular vesicles of the Gram-positive gut symbiont </w:t>
+      </w:r>
+      <w:r>
+        <w:rPr>
+          <w:b w:val="0"/>
+          <w:i/>
+          <w:sz w:val="19"/>
+        </w:rPr>
+        <w:t>Bifidobacterium longum</w:t>
+      </w:r>
+      <w:r>
+        <w:rPr>
+          <w:b w:val="0"/>
+          <w:i w:val="0"/>
+          <w:sz w:val="19"/>
+        </w:rPr>
+        <w:t xml:space="preserve"> induce immune-modulatory, anti-inflammatory effects. </w:t>
+      </w:r>
+      <w:r>
+        <w:rPr>
+          <w:b w:val="0"/>
+          <w:i/>
+          <w:sz w:val="19"/>
+        </w:rPr>
+        <w:t>npj Biofilms Microbiomes.</w:t>
+      </w:r>
+      <w:r>
+        <w:rPr>
+          <w:b w:val="0"/>
+          <w:i w:val="0"/>
+          <w:sz w:val="19"/>
+        </w:rPr>
+        <w:t xml:space="preserve"> 2023;9:30.</w:t>
+      </w:r>
+    </w:p>
+    <w:p>
+      <w:pPr>
+        <w:tabs>
+          <w:tab w:pos="510" w:val="left"/>
+        </w:tabs>
+        <w:spacing w:after="60"/>
+        <w:ind w:left="510" w:hanging="510"/>
+      </w:pPr>
+      <w:r>
+        <w:rPr>
+          <w:b w:val="0"/>
+          <w:i w:val="0"/>
+          <w:color w:val="555555"/>
+          <w:sz w:val="19"/>
+        </w:rPr>
+        <w:t>6.</w:t>
+        <w:tab/>
+      </w:r>
+      <w:r>
+        <w:rPr>
+          <w:b w:val="0"/>
+          <w:i w:val="0"/>
+          <w:sz w:val="19"/>
+        </w:rPr>
+        <w:t xml:space="preserve">Ben-Assa N, Coyne MJ, Fomenkov A, Livny J, Robins WP, Muniesa M, Carey V, </w:t>
+      </w:r>
+      <w:r>
+        <w:rPr>
+          <w:b/>
+          <w:i w:val="0"/>
+          <w:sz w:val="19"/>
+        </w:rPr>
+        <w:t>Carasso S</w:t>
+      </w:r>
+      <w:r>
+        <w:rPr>
+          <w:b w:val="0"/>
+          <w:i w:val="0"/>
+          <w:sz w:val="19"/>
+        </w:rPr>
+        <w:t xml:space="preserve">, Gefen T, Jofre J, Roberts RJ, Comstock LE, Geva-Zatorsky N. Analysis of a phase-variable restriction modification system of the human gut symbiont </w:t>
+      </w:r>
+      <w:r>
+        <w:rPr>
+          <w:b w:val="0"/>
+          <w:i/>
+          <w:sz w:val="19"/>
+        </w:rPr>
+        <w:t>Bacteroides fragilis</w:t>
+      </w:r>
+      <w:r>
+        <w:rPr>
+          <w:b w:val="0"/>
+          <w:i w:val="0"/>
+          <w:sz w:val="19"/>
+        </w:rPr>
+        <w:t xml:space="preserve">. </w:t>
+      </w:r>
+      <w:r>
+        <w:rPr>
+          <w:b w:val="0"/>
+          <w:i/>
+          <w:sz w:val="19"/>
+        </w:rPr>
+        <w:t>Nucleic Acids Res.</w:t>
+      </w:r>
+      <w:r>
+        <w:rPr>
+          <w:b w:val="0"/>
+          <w:i w:val="0"/>
+          <w:sz w:val="19"/>
+        </w:rPr>
+        <w:t xml:space="preserve"> 2020;48(19):11040–11053.</w:t>
+      </w:r>
+    </w:p>
+    <w:p>
+      <w:pPr>
+        <w:tabs>
+          <w:tab w:pos="510" w:val="left"/>
+        </w:tabs>
+        <w:spacing w:after="60"/>
+        <w:ind w:left="510" w:hanging="510"/>
+      </w:pPr>
+      <w:r>
+        <w:rPr>
+          <w:b w:val="0"/>
+          <w:i w:val="0"/>
+          <w:color w:val="555555"/>
+          <w:sz w:val="19"/>
+        </w:rPr>
+        <w:t>Preprint.</w:t>
+        <w:tab/>
+      </w:r>
+      <w:r>
+        <w:rPr>
+          <w:b w:val="0"/>
+          <w:i w:val="0"/>
+          <w:sz w:val="19"/>
+        </w:rPr>
+        <w:t xml:space="preserve">Ghezzi H, Wolff R, Jain A, Burckhardt JC, Hunter M, Ng KM, </w:t>
+      </w:r>
+      <w:r>
+        <w:rPr>
+          <w:b/>
+          <w:i w:val="0"/>
+          <w:sz w:val="19"/>
+        </w:rPr>
+        <w:t>Carasso S</w:t>
+      </w:r>
+      <w:r>
+        <w:rPr>
+          <w:b w:val="0"/>
+          <w:i w:val="0"/>
+          <w:sz w:val="19"/>
+        </w:rPr>
+        <w:t xml:space="preserve">, Geva-Zatorsky N, Garud N, Tropini C. Growth capacity and mortality burden shape microbial persistence under osmotic stress in </w:t>
+      </w:r>
+      <w:r>
+        <w:rPr>
+          <w:b w:val="0"/>
+          <w:i/>
+          <w:sz w:val="19"/>
+        </w:rPr>
+        <w:t>Bacteroides thetaiotaomicron</w:t>
+      </w:r>
+      <w:r>
+        <w:rPr>
+          <w:b w:val="0"/>
+          <w:i w:val="0"/>
+          <w:sz w:val="19"/>
+        </w:rPr>
+        <w:t xml:space="preserve">. </w:t>
+      </w:r>
+      <w:r>
+        <w:rPr>
+          <w:b w:val="0"/>
+          <w:i/>
+          <w:sz w:val="19"/>
+        </w:rPr>
+        <w:t>bioRxiv.</w:t>
+      </w:r>
+      <w:r>
+        <w:rPr>
+          <w:b w:val="0"/>
+          <w:i w:val="0"/>
+          <w:sz w:val="19"/>
+        </w:rPr>
+        <w:t xml:space="preserve"> 2026.</w:t>
+      </w:r>
+    </w:p>
+    <w:p>
+      <w:pPr>
+        <w:tabs>
+          <w:tab w:pos="510" w:val="left"/>
+        </w:tabs>
+        <w:spacing w:after="60"/>
+        <w:ind w:left="510" w:hanging="510"/>
+      </w:pPr>
+      <w:r>
+        <w:rPr>
+          <w:b w:val="0"/>
+          <w:i w:val="0"/>
+          <w:color w:val="555555"/>
+          <w:sz w:val="19"/>
+        </w:rPr>
+        <w:t>Preview.</w:t>
+        <w:tab/>
+      </w:r>
+      <w:r>
+        <w:rPr>
+          <w:b/>
+          <w:i w:val="0"/>
+          <w:sz w:val="19"/>
+        </w:rPr>
+        <w:t>Carasso S</w:t>
+      </w:r>
+      <w:r>
+        <w:rPr>
+          <w:b w:val="0"/>
+          <w:i w:val="0"/>
+          <w:sz w:val="19"/>
+        </w:rPr>
+        <w:t xml:space="preserve">, Hajjo H, Geva-Zatorsky N. Phage-bacteria associations: analyze, match, develop therapies. </w:t>
+      </w:r>
+      <w:r>
+        <w:rPr>
+          <w:b w:val="0"/>
+          <w:i/>
+          <w:sz w:val="19"/>
+        </w:rPr>
+        <w:t>Cell Host Microbe.</w:t>
+      </w:r>
+      <w:r>
+        <w:rPr>
+          <w:b w:val="0"/>
+          <w:i w:val="0"/>
+          <w:sz w:val="19"/>
+        </w:rPr>
+        <w:t xml:space="preserve"> 2020;28:353–355.</w:t>
+      </w:r>
+    </w:p>
+    <w:p>
+      <w:pPr>
+        <w:keepNext/>
+        <w:spacing w:before="80" w:after="40"/>
+      </w:pPr>
+      <w:r>
+        <w:rPr>
+          <w:b/>
+          <w:i w:val="0"/>
+          <w:color w:val="555555"/>
+          <w:sz w:val="19"/>
+        </w:rPr>
+        <w:t>Microbiome, infection and clinical studies</w:t>
+      </w:r>
+    </w:p>
+    <w:p>
+      <w:pPr>
+        <w:tabs>
+          <w:tab w:pos="510" w:val="left"/>
+        </w:tabs>
+        <w:spacing w:after="60"/>
+        <w:ind w:left="510" w:hanging="510"/>
+      </w:pPr>
+      <w:r>
+        <w:rPr>
+          <w:b w:val="0"/>
+          <w:i w:val="0"/>
+          <w:color w:val="555555"/>
+          <w:sz w:val="19"/>
+        </w:rPr>
+        <w:t>1.</w:t>
+        <w:tab/>
+      </w:r>
+      <w:r>
+        <w:rPr>
+          <w:b/>
+          <w:i w:val="0"/>
+          <w:sz w:val="19"/>
+        </w:rPr>
+        <w:t>Carasso S</w:t>
+      </w:r>
+      <w:r>
+        <w:rPr>
+          <w:b w:val="0"/>
+          <w:i w:val="0"/>
+          <w:sz w:val="19"/>
+        </w:rPr>
+        <w:t xml:space="preserve">, Gefen T, Bakria R, Bar-Yoseph H, Geva-Zatorsky N. Microbiome changes associated with FMT-mediated clearance of antibiotic-resistant </w:t>
+      </w:r>
+      <w:r>
+        <w:rPr>
+          <w:b w:val="0"/>
+          <w:i/>
+          <w:sz w:val="19"/>
+        </w:rPr>
+        <w:t>Klebsiella pneumoniae</w:t>
+      </w:r>
+      <w:r>
+        <w:rPr>
+          <w:b w:val="0"/>
+          <w:i w:val="0"/>
+          <w:sz w:val="19"/>
+        </w:rPr>
+        <w:t xml:space="preserve"> in a murine carriage model. </w:t>
+      </w:r>
+      <w:r>
+        <w:rPr>
+          <w:b w:val="0"/>
+          <w:i/>
+          <w:sz w:val="19"/>
+        </w:rPr>
+        <w:t>BMC Microbiol.</w:t>
+      </w:r>
+      <w:r>
+        <w:rPr>
+          <w:b w:val="0"/>
+          <w:i w:val="0"/>
+          <w:sz w:val="19"/>
+        </w:rPr>
+        <w:t xml:space="preserve"> 2026;26:898.</w:t>
+      </w:r>
+    </w:p>
+    <w:p>
+      <w:pPr>
+        <w:tabs>
+          <w:tab w:pos="510" w:val="left"/>
+        </w:tabs>
+        <w:spacing w:after="60"/>
+        <w:ind w:left="510" w:hanging="510"/>
+      </w:pPr>
+      <w:r>
+        <w:rPr>
+          <w:b w:val="0"/>
+          <w:i w:val="0"/>
+          <w:color w:val="555555"/>
+          <w:sz w:val="19"/>
+        </w:rPr>
+        <w:t>2.</w:t>
+        <w:tab/>
+      </w:r>
+      <w:r>
+        <w:rPr>
+          <w:b w:val="0"/>
+          <w:i w:val="0"/>
+          <w:sz w:val="19"/>
+        </w:rPr>
+        <w:t xml:space="preserve">Ben-Assa N, Naddaf R, </w:t>
+      </w:r>
+      <w:r>
+        <w:rPr>
+          <w:b/>
+          <w:i w:val="0"/>
+          <w:sz w:val="19"/>
+        </w:rPr>
+        <w:t>Carasso S</w:t>
+      </w:r>
+      <w:r>
+        <w:rPr>
+          <w:b w:val="0"/>
+          <w:i w:val="0"/>
+          <w:sz w:val="19"/>
+        </w:rPr>
+        <w:t xml:space="preserve">, Dagan O, Sason A, Gefen T, Geva-Zatorsky N. Intra-species competition combats vancomycin-resistant enterococci. </w:t>
+      </w:r>
+      <w:r>
+        <w:rPr>
+          <w:b w:val="0"/>
+          <w:i/>
+          <w:sz w:val="19"/>
+        </w:rPr>
+        <w:t>Gut Microbes.</w:t>
+      </w:r>
+      <w:r>
+        <w:rPr>
+          <w:b w:val="0"/>
+          <w:i w:val="0"/>
+          <w:sz w:val="19"/>
+        </w:rPr>
+        <w:t xml:space="preserve"> 2026;18(1):2647529.</w:t>
+      </w:r>
+    </w:p>
+    <w:p>
+      <w:pPr>
+        <w:tabs>
+          <w:tab w:pos="510" w:val="left"/>
+        </w:tabs>
+        <w:spacing w:after="60"/>
+        <w:ind w:left="510" w:hanging="510"/>
+      </w:pPr>
+      <w:r>
+        <w:rPr>
+          <w:b w:val="0"/>
+          <w:i w:val="0"/>
+          <w:color w:val="555555"/>
+          <w:sz w:val="19"/>
+        </w:rPr>
+        <w:t>3.</w:t>
+        <w:tab/>
+      </w:r>
+      <w:r>
+        <w:rPr>
+          <w:b w:val="0"/>
+          <w:i w:val="0"/>
+          <w:sz w:val="19"/>
+        </w:rPr>
+        <w:t>†Naddaf R, †Shmilovich H, †</w:t>
+      </w:r>
+      <w:r>
+        <w:rPr>
+          <w:b/>
+          <w:i w:val="0"/>
+          <w:sz w:val="19"/>
+        </w:rPr>
+        <w:t>Carasso S</w:t>
+      </w:r>
+      <w:r>
+        <w:rPr>
+          <w:b w:val="0"/>
+          <w:i w:val="0"/>
+          <w:sz w:val="19"/>
+        </w:rPr>
+        <w:t xml:space="preserve">, Keshet-David R, Herren R, Gefen T, Goshen-Lago T, Zwang Y, Livyatan I, Shental N, Haberfeld O, Straussman R, Markar SR, Nilsson M, Kashtan H, Ben-Aharon I, Geva-Zatorsky N. Esophageal microbiome correlates with post-esophagectomy anastomotic leak in cancer patients. </w:t>
+      </w:r>
+      <w:r>
+        <w:rPr>
+          <w:b w:val="0"/>
+          <w:i/>
+          <w:sz w:val="19"/>
+        </w:rPr>
+        <w:t>ESMO Gastrointest Oncol.</w:t>
+      </w:r>
+      <w:r>
+        <w:rPr>
+          <w:b w:val="0"/>
+          <w:i w:val="0"/>
+          <w:sz w:val="19"/>
+        </w:rPr>
+        <w:t xml:space="preserve"> 2025;8:100172.</w:t>
+      </w:r>
+    </w:p>
+    <w:p>
+      <w:pPr>
+        <w:tabs>
+          <w:tab w:pos="510" w:val="left"/>
+        </w:tabs>
+        <w:spacing w:after="60"/>
+        <w:ind w:left="510" w:hanging="510"/>
+      </w:pPr>
+      <w:r>
+        <w:rPr>
+          <w:b w:val="0"/>
+          <w:i w:val="0"/>
+          <w:color w:val="555555"/>
+          <w:sz w:val="19"/>
+        </w:rPr>
+        <w:t>4.</w:t>
+        <w:tab/>
+      </w:r>
+      <w:r>
+        <w:rPr>
+          <w:b w:val="0"/>
+          <w:i w:val="0"/>
+          <w:sz w:val="19"/>
+        </w:rPr>
+        <w:t>†Naddaf R, †</w:t>
+      </w:r>
+      <w:r>
+        <w:rPr>
+          <w:b/>
+          <w:i w:val="0"/>
+          <w:sz w:val="19"/>
+        </w:rPr>
+        <w:t>Carasso S</w:t>
+      </w:r>
+      <w:r>
+        <w:rPr>
+          <w:b w:val="0"/>
+          <w:i w:val="0"/>
+          <w:sz w:val="19"/>
+        </w:rPr>
+        <w:t xml:space="preserve">, Reznick-Levi G, Hasnis E, Qarawani A, Maza I, Gefen T, Half EE, Geva-Zatorsky N. Gut microbial signatures are associated with Lynch syndrome and cancer history in Druze communities in Israel. </w:t>
+      </w:r>
+      <w:r>
+        <w:rPr>
+          <w:b w:val="0"/>
+          <w:i/>
+          <w:sz w:val="19"/>
+        </w:rPr>
+        <w:t>Sci Rep.</w:t>
+      </w:r>
+      <w:r>
+        <w:rPr>
+          <w:b w:val="0"/>
+          <w:i w:val="0"/>
+          <w:sz w:val="19"/>
+        </w:rPr>
+        <w:t xml:space="preserve"> 2023;13:20677.</w:t>
+      </w:r>
+    </w:p>
+    <w:p>
+      <w:pPr>
+        <w:tabs>
+          <w:tab w:pos="510" w:val="left"/>
+        </w:tabs>
+        <w:spacing w:after="60"/>
+        <w:ind w:left="510" w:hanging="510"/>
+      </w:pPr>
+      <w:r>
+        <w:rPr>
+          <w:b w:val="0"/>
+          <w:i w:val="0"/>
+          <w:color w:val="555555"/>
+          <w:sz w:val="19"/>
+        </w:rPr>
+        <w:t>5.</w:t>
+        <w:tab/>
+      </w:r>
+      <w:r>
+        <w:rPr>
+          <w:b w:val="0"/>
+          <w:i w:val="0"/>
+          <w:sz w:val="19"/>
+        </w:rPr>
+        <w:t>†Mudrik-Zohar H, †</w:t>
+      </w:r>
+      <w:r>
+        <w:rPr>
+          <w:b/>
+          <w:i w:val="0"/>
+          <w:sz w:val="19"/>
+        </w:rPr>
+        <w:t>Carasso S</w:t>
+      </w:r>
+      <w:r>
+        <w:rPr>
+          <w:b w:val="0"/>
+          <w:i w:val="0"/>
+          <w:sz w:val="19"/>
+        </w:rPr>
+        <w:t xml:space="preserve">, Gefen T, Zalmanovich A, Katzir M, Cohen Y, Paitan Y, Geva-Zatorsky N, Chowers M. Microbiome characterization of infected diabetic foot ulcers in association with clinical outcomes: traditional cultures versus molecular sequencing methods. </w:t>
+      </w:r>
+      <w:r>
+        <w:rPr>
+          <w:b w:val="0"/>
+          <w:i/>
+          <w:sz w:val="19"/>
+        </w:rPr>
+        <w:t>Front Cell Infect Microbiol.</w:t>
+      </w:r>
+      <w:r>
+        <w:rPr>
+          <w:b w:val="0"/>
+          <w:i w:val="0"/>
+          <w:sz w:val="19"/>
+        </w:rPr>
+        <w:t xml:space="preserve"> 2022;12:836699.</w:t>
+      </w:r>
+    </w:p>
+    <w:p>
+      <w:pPr>
+        <w:tabs>
+          <w:tab w:pos="510" w:val="left"/>
+        </w:tabs>
+        <w:spacing w:after="60"/>
+        <w:ind w:left="510" w:hanging="510"/>
+      </w:pPr>
+      <w:r>
+        <w:rPr>
+          <w:b w:val="0"/>
+          <w:i w:val="0"/>
+          <w:color w:val="555555"/>
+          <w:sz w:val="19"/>
+        </w:rPr>
+        <w:t>6.</w:t>
+        <w:tab/>
+      </w:r>
+      <w:r>
+        <w:rPr>
+          <w:b/>
+          <w:i w:val="0"/>
+          <w:sz w:val="19"/>
+        </w:rPr>
+        <w:t>Carasso S</w:t>
+      </w:r>
+      <w:r>
+        <w:rPr>
+          <w:b w:val="0"/>
+          <w:i w:val="0"/>
+          <w:sz w:val="19"/>
+        </w:rPr>
+        <w:t xml:space="preserve">, Fishman B, Lask LS, Shochat T, Geva-Zatorsky N, Tauber E. Metagenomic analysis reveals the signature of gut microbiota associated with human chronotypes. </w:t>
+      </w:r>
+      <w:r>
+        <w:rPr>
+          <w:b w:val="0"/>
+          <w:i/>
+          <w:sz w:val="19"/>
+        </w:rPr>
+        <w:t>FASEB J.</w:t>
+      </w:r>
+      <w:r>
+        <w:rPr>
+          <w:b w:val="0"/>
+          <w:i w:val="0"/>
+          <w:sz w:val="19"/>
+        </w:rPr>
+        <w:t xml:space="preserve"> 2021;35(11):e22011.</w:t>
+      </w:r>
+    </w:p>
+    <w:p>
+      <w:pPr>
+        <w:tabs>
+          <w:tab w:pos="510" w:val="left"/>
+        </w:tabs>
+        <w:spacing w:after="60"/>
+        <w:ind w:left="510" w:hanging="510"/>
+      </w:pPr>
+      <w:r>
+        <w:rPr>
+          <w:b w:val="0"/>
+          <w:i w:val="0"/>
+          <w:color w:val="555555"/>
+          <w:sz w:val="19"/>
+        </w:rPr>
+        <w:t>7.</w:t>
+        <w:tab/>
+      </w:r>
+      <w:r>
+        <w:rPr>
+          <w:b w:val="0"/>
+          <w:i w:val="0"/>
+          <w:sz w:val="19"/>
+        </w:rPr>
+        <w:t xml:space="preserve">Berkowitz E, Kopelman Y, Kadosh D, </w:t>
+      </w:r>
+      <w:r>
+        <w:rPr>
+          <w:b/>
+          <w:i w:val="0"/>
+          <w:sz w:val="19"/>
+        </w:rPr>
+        <w:t>Carasso S</w:t>
+      </w:r>
+      <w:r>
+        <w:rPr>
+          <w:b w:val="0"/>
+          <w:i w:val="0"/>
+          <w:sz w:val="19"/>
+        </w:rPr>
+        <w:t xml:space="preserve">, Tiosano B, Kesler A, Geva-Zatorsky N. "More guts than brains?" The role of gut microbiota in idiopathic intracranial hypertension. </w:t>
+      </w:r>
+      <w:r>
+        <w:rPr>
+          <w:b w:val="0"/>
+          <w:i/>
+          <w:sz w:val="19"/>
+        </w:rPr>
+        <w:t>J Neuroophthalmol.</w:t>
+      </w:r>
+      <w:r>
+        <w:rPr>
+          <w:b w:val="0"/>
+          <w:i w:val="0"/>
+          <w:sz w:val="19"/>
+        </w:rPr>
+        <w:t xml:space="preserve"> 2022;42(1):e70–e77.</w:t>
+      </w:r>
+    </w:p>
+    <w:p>
+      <w:pPr>
+        <w:tabs>
+          <w:tab w:pos="510" w:val="left"/>
+        </w:tabs>
+        <w:spacing w:after="60"/>
+        <w:ind w:left="510" w:hanging="510"/>
+      </w:pPr>
+      <w:r>
+        <w:rPr>
+          <w:b w:val="0"/>
+          <w:i w:val="0"/>
+          <w:color w:val="555555"/>
+          <w:sz w:val="19"/>
+        </w:rPr>
+        <w:t>8.</w:t>
+        <w:tab/>
+      </w:r>
+      <w:r>
+        <w:rPr>
+          <w:b w:val="0"/>
+          <w:i w:val="0"/>
+          <w:sz w:val="19"/>
+        </w:rPr>
+        <w:t>†Bar-Yoseph H, †</w:t>
+      </w:r>
+      <w:r>
+        <w:rPr>
+          <w:b/>
+          <w:i w:val="0"/>
+          <w:sz w:val="19"/>
+        </w:rPr>
+        <w:t>Carasso S</w:t>
+      </w:r>
+      <w:r>
+        <w:rPr>
+          <w:b w:val="0"/>
+          <w:i w:val="0"/>
+          <w:sz w:val="19"/>
+        </w:rPr>
+        <w:t xml:space="preserve">, Shklar S, Korytny A, Even Dar R, Daoud H, Nassar R, Maharshak N, Hussein K, Geffen Y, Chowers Y, Geva-Zatorsky N, Paul M. Oral capsulized fecal microbiota transplantation for eradication of carbapenemase-producing Enterobacteriaceae colonization with a metagenomic perspective. </w:t>
+      </w:r>
+      <w:r>
+        <w:rPr>
+          <w:b w:val="0"/>
+          <w:i/>
+          <w:sz w:val="19"/>
+        </w:rPr>
+        <w:t>Clin Infect Dis.</w:t>
+      </w:r>
+      <w:r>
+        <w:rPr>
+          <w:b w:val="0"/>
+          <w:i w:val="0"/>
+          <w:sz w:val="19"/>
+        </w:rPr>
+        <w:t xml:space="preserve"> 2021;73(1):e166–e175.</w:t>
+      </w:r>
+    </w:p>
+    <w:p>
+      <w:pPr>
+        <w:keepNext/>
+        <w:spacing w:before="80" w:after="40"/>
+      </w:pPr>
+      <w:r>
+        <w:rPr>
+          <w:b/>
+          <w:i w:val="0"/>
+          <w:color w:val="555555"/>
+          <w:sz w:val="19"/>
+        </w:rPr>
+        <w:t>Other collaborations</w:t>
+      </w:r>
+    </w:p>
+    <w:p>
+      <w:pPr>
+        <w:tabs>
+          <w:tab w:pos="510" w:val="left"/>
+        </w:tabs>
+        <w:spacing w:after="60"/>
+        <w:ind w:left="510" w:hanging="510"/>
+      </w:pPr>
+      <w:r>
+        <w:rPr>
+          <w:b w:val="0"/>
+          <w:i w:val="0"/>
+          <w:color w:val="555555"/>
+          <w:sz w:val="19"/>
+        </w:rPr>
+        <w:t>1.</w:t>
         <w:tab/>
       </w:r>
       <w:r>
@@ -709,7 +1628,7 @@
           <w:i/>
           <w:sz w:val="19"/>
         </w:rPr>
-        <w:t>J Cranio-Maxillofac Surg</w:t>
+        <w:t>J Cranio-Maxillofac Surg.</w:t>
       </w:r>
       <w:r>
         <w:rPr>
@@ -717,7 +1636,7 @@
           <w:i w:val="0"/>
           <w:sz w:val="19"/>
         </w:rPr>
-        <w:t>. 2025.</w:t>
+        <w:t xml:space="preserve"> 2025;53(10):1720–1730.</w:t>
       </w:r>
     </w:p>
     <w:p>
@@ -735,7 +1654,7 @@
           <w:color w:val="555555"/>
           <w:sz w:val="19"/>
         </w:rPr>
-        <w:t>13.</w:t>
+        <w:t>2.</w:t>
         <w:tab/>
       </w:r>
       <w:r>
@@ -768,7 +1687,7 @@
           <w:i/>
           <w:sz w:val="19"/>
         </w:rPr>
-        <w:t>J Cranio-Maxillofac Surg</w:t>
+        <w:t>J Cranio-Maxillofac Surg.</w:t>
       </w:r>
       <w:r>
         <w:rPr>
@@ -776,578 +1695,7 @@
           <w:i w:val="0"/>
           <w:sz w:val="19"/>
         </w:rPr>
-        <w:t>. 2025.</w:t>
-      </w:r>
-    </w:p>
-    <w:p>
-      <w:pPr>
-        <w:tabs>
-          <w:tab w:pos="510" w:val="left"/>
-        </w:tabs>
-        <w:spacing w:after="60"/>
-        <w:ind w:left="510" w:hanging="510"/>
-      </w:pPr>
-      <w:r>
-        <w:rPr>
-          <w:b w:val="0"/>
-          <w:i w:val="0"/>
-          <w:color w:val="555555"/>
-          <w:sz w:val="19"/>
-        </w:rPr>
-        <w:t>12.</w:t>
-        <w:tab/>
-      </w:r>
-      <w:r>
-        <w:rPr>
-          <w:b w:val="0"/>
-          <w:i w:val="0"/>
-          <w:sz w:val="19"/>
-        </w:rPr>
-        <w:t>†Naddaf R, †Shmilovich H, †</w:t>
-      </w:r>
-      <w:r>
-        <w:rPr>
-          <w:b/>
-          <w:i w:val="0"/>
-          <w:sz w:val="19"/>
-        </w:rPr>
-        <w:t>Carasso S</w:t>
-      </w:r>
-      <w:r>
-        <w:rPr>
-          <w:b w:val="0"/>
-          <w:i w:val="0"/>
-          <w:sz w:val="19"/>
-        </w:rPr>
-        <w:t xml:space="preserve">, Keshet-David R, Herren R, Gefen T, et al. Esophageal microbiome correlates with post-esophagectomy anastomotic leak in cancer patients. </w:t>
-      </w:r>
-      <w:r>
-        <w:rPr>
-          <w:b w:val="0"/>
-          <w:i/>
-          <w:sz w:val="19"/>
-        </w:rPr>
-        <w:t>ESMO Gastrointest Oncol</w:t>
-      </w:r>
-      <w:r>
-        <w:rPr>
-          <w:b w:val="0"/>
-          <w:i w:val="0"/>
-          <w:sz w:val="19"/>
-        </w:rPr>
-        <w:t>. 2025.</w:t>
-      </w:r>
-    </w:p>
-    <w:p>
-      <w:pPr>
-        <w:tabs>
-          <w:tab w:pos="510" w:val="left"/>
-        </w:tabs>
-        <w:spacing w:after="60"/>
-        <w:ind w:left="510" w:hanging="510"/>
-      </w:pPr>
-      <w:r>
-        <w:rPr>
-          <w:b w:val="0"/>
-          <w:i w:val="0"/>
-          <w:color w:val="555555"/>
-          <w:sz w:val="19"/>
-        </w:rPr>
-        <w:t>11.</w:t>
-        <w:tab/>
-      </w:r>
-      <w:r>
-        <w:rPr>
-          <w:b w:val="0"/>
-          <w:i w:val="0"/>
-          <w:sz w:val="19"/>
-        </w:rPr>
-        <w:t xml:space="preserve">Gal-Mandelbaum N, </w:t>
-      </w:r>
-      <w:r>
-        <w:rPr>
-          <w:b/>
-          <w:i w:val="0"/>
-          <w:sz w:val="19"/>
-        </w:rPr>
-        <w:t>Carasso S</w:t>
-      </w:r>
-      <w:r>
-        <w:rPr>
-          <w:b w:val="0"/>
-          <w:i w:val="0"/>
-          <w:sz w:val="19"/>
-        </w:rPr>
-        <w:t xml:space="preserve">, Kedem A, Ziv T, Keshet-David R, Abboud R, et al. Dietary carbohydrates alter immune-modulatory functionalities and DNA inversions in </w:t>
-      </w:r>
-      <w:r>
-        <w:rPr>
-          <w:b w:val="0"/>
-          <w:i/>
-          <w:sz w:val="19"/>
-        </w:rPr>
-        <w:t>Bacteroides thetaiotaomicron</w:t>
-      </w:r>
-      <w:r>
-        <w:rPr>
-          <w:b w:val="0"/>
-          <w:i w:val="0"/>
-          <w:sz w:val="19"/>
-        </w:rPr>
-        <w:t xml:space="preserve">. </w:t>
-      </w:r>
-      <w:r>
-        <w:rPr>
-          <w:b w:val="0"/>
-          <w:i/>
-          <w:sz w:val="19"/>
-        </w:rPr>
-        <w:t>Nat Commun</w:t>
-      </w:r>
-      <w:r>
-        <w:rPr>
-          <w:b w:val="0"/>
-          <w:i w:val="0"/>
-          <w:sz w:val="19"/>
-        </w:rPr>
-        <w:t>. 2025.</w:t>
-      </w:r>
-    </w:p>
-    <w:p>
-      <w:pPr>
-        <w:tabs>
-          <w:tab w:pos="510" w:val="left"/>
-        </w:tabs>
-        <w:spacing w:after="60"/>
-        <w:ind w:left="510" w:hanging="510"/>
-      </w:pPr>
-      <w:r>
-        <w:rPr>
-          <w:b w:val="0"/>
-          <w:i w:val="0"/>
-          <w:color w:val="555555"/>
-          <w:sz w:val="19"/>
-        </w:rPr>
-        <w:t>10.</w:t>
-        <w:tab/>
-      </w:r>
-      <w:r>
-        <w:rPr>
-          <w:b w:val="0"/>
-          <w:i w:val="0"/>
-          <w:sz w:val="19"/>
-        </w:rPr>
-        <w:t>†</w:t>
-      </w:r>
-      <w:r>
-        <w:rPr>
-          <w:b/>
-          <w:i w:val="0"/>
-          <w:sz w:val="19"/>
-        </w:rPr>
-        <w:t>Carasso S</w:t>
-      </w:r>
-      <w:r>
-        <w:rPr>
-          <w:b w:val="0"/>
-          <w:i w:val="0"/>
-          <w:sz w:val="19"/>
-        </w:rPr>
-        <w:t xml:space="preserve">, †Keshet-David R, Zhang J, Hajjo H, Kadosh-Kariti D, Gefen T, et al. Bacteriophage-driven DNA inversions shape bacterial functionality and long-term co-existence in </w:t>
-      </w:r>
-      <w:r>
-        <w:rPr>
-          <w:b w:val="0"/>
-          <w:i/>
-          <w:sz w:val="19"/>
-        </w:rPr>
-        <w:t>Bacteroides fragilis</w:t>
-      </w:r>
-      <w:r>
-        <w:rPr>
-          <w:b w:val="0"/>
-          <w:i w:val="0"/>
-          <w:sz w:val="19"/>
-        </w:rPr>
-        <w:t xml:space="preserve">. </w:t>
-      </w:r>
-      <w:r>
-        <w:rPr>
-          <w:b w:val="0"/>
-          <w:i/>
-          <w:sz w:val="19"/>
-        </w:rPr>
-        <w:t>Gut Microbes</w:t>
-      </w:r>
-      <w:r>
-        <w:rPr>
-          <w:b w:val="0"/>
-          <w:i w:val="0"/>
-          <w:sz w:val="19"/>
-        </w:rPr>
-        <w:t>. 2025.</w:t>
-      </w:r>
-    </w:p>
-    <w:p>
-      <w:pPr>
-        <w:tabs>
-          <w:tab w:pos="510" w:val="left"/>
-        </w:tabs>
-        <w:spacing w:after="60"/>
-        <w:ind w:left="510" w:hanging="510"/>
-      </w:pPr>
-      <w:r>
-        <w:rPr>
-          <w:b w:val="0"/>
-          <w:i w:val="0"/>
-          <w:color w:val="555555"/>
-          <w:sz w:val="19"/>
-        </w:rPr>
-        <w:t>9.</w:t>
-        <w:tab/>
-      </w:r>
-      <w:r>
-        <w:rPr>
-          <w:b w:val="0"/>
-          <w:i w:val="0"/>
-          <w:sz w:val="19"/>
-        </w:rPr>
-        <w:t>†</w:t>
-      </w:r>
-      <w:r>
-        <w:rPr>
-          <w:b/>
-          <w:i w:val="0"/>
-          <w:sz w:val="19"/>
-        </w:rPr>
-        <w:t>Carasso S</w:t>
-      </w:r>
-      <w:r>
-        <w:rPr>
-          <w:b w:val="0"/>
-          <w:i w:val="0"/>
-          <w:sz w:val="19"/>
-        </w:rPr>
-        <w:t xml:space="preserve">, †Zaatry R, †Hajjo H, †Kadosh-Kariti D, Ben-Assa N, Naddaf R, et al. Inflammation and bacteriophages affect DNA inversion states and functionality of the gut microbiota. </w:t>
-      </w:r>
-      <w:r>
-        <w:rPr>
-          <w:b w:val="0"/>
-          <w:i/>
-          <w:sz w:val="19"/>
-        </w:rPr>
-        <w:t>Cell Host Microbe</w:t>
-      </w:r>
-      <w:r>
-        <w:rPr>
-          <w:b w:val="0"/>
-          <w:i w:val="0"/>
-          <w:sz w:val="19"/>
-        </w:rPr>
-        <w:t>. 2024.</w:t>
-      </w:r>
-    </w:p>
-    <w:p>
-      <w:pPr>
-        <w:tabs>
-          <w:tab w:pos="510" w:val="left"/>
-        </w:tabs>
-        <w:spacing w:after="60"/>
-        <w:ind w:left="510" w:hanging="510"/>
-      </w:pPr>
-      <w:r>
-        <w:rPr>
-          <w:b w:val="0"/>
-          <w:i w:val="0"/>
-          <w:color w:val="555555"/>
-          <w:sz w:val="19"/>
-        </w:rPr>
-        <w:t>8.</w:t>
-        <w:tab/>
-      </w:r>
-      <w:r>
-        <w:rPr>
-          <w:b w:val="0"/>
-          <w:i w:val="0"/>
-          <w:sz w:val="19"/>
-        </w:rPr>
-        <w:t>†Naddaf R, †</w:t>
-      </w:r>
-      <w:r>
-        <w:rPr>
-          <w:b/>
-          <w:i w:val="0"/>
-          <w:sz w:val="19"/>
-        </w:rPr>
-        <w:t>Carasso S</w:t>
-      </w:r>
-      <w:r>
-        <w:rPr>
-          <w:b w:val="0"/>
-          <w:i w:val="0"/>
-          <w:sz w:val="19"/>
-        </w:rPr>
-        <w:t xml:space="preserve">, Reznick-Levi G, Hasnis E, Qarawani A, Maza I, et al. Gut microbial signatures are associated with Lynch syndrome and cancer history in Druze communities in Israel. </w:t>
-      </w:r>
-      <w:r>
-        <w:rPr>
-          <w:b w:val="0"/>
-          <w:i/>
-          <w:sz w:val="19"/>
-        </w:rPr>
-        <w:t>Sci Rep</w:t>
-      </w:r>
-      <w:r>
-        <w:rPr>
-          <w:b w:val="0"/>
-          <w:i w:val="0"/>
-          <w:sz w:val="19"/>
-        </w:rPr>
-        <w:t>. 2023.</w:t>
-      </w:r>
-    </w:p>
-    <w:p>
-      <w:pPr>
-        <w:tabs>
-          <w:tab w:pos="510" w:val="left"/>
-        </w:tabs>
-        <w:spacing w:after="60"/>
-        <w:ind w:left="510" w:hanging="510"/>
-      </w:pPr>
-      <w:r>
-        <w:rPr>
-          <w:b w:val="0"/>
-          <w:i w:val="0"/>
-          <w:color w:val="555555"/>
-          <w:sz w:val="19"/>
-        </w:rPr>
-        <w:t>7.</w:t>
-        <w:tab/>
-      </w:r>
-      <w:r>
-        <w:rPr>
-          <w:b w:val="0"/>
-          <w:i w:val="0"/>
-          <w:sz w:val="19"/>
-        </w:rPr>
-        <w:t xml:space="preserve">Mandelbaum N, Zhang L, </w:t>
-      </w:r>
-      <w:r>
-        <w:rPr>
-          <w:b/>
-          <w:i w:val="0"/>
-          <w:sz w:val="19"/>
-        </w:rPr>
-        <w:t>Carasso S</w:t>
-      </w:r>
-      <w:r>
-        <w:rPr>
-          <w:b w:val="0"/>
-          <w:i w:val="0"/>
-          <w:sz w:val="19"/>
-        </w:rPr>
-        <w:t xml:space="preserve">, Ziv T, Lifshiz-Simon S, Davidovich I, et al. Extracellular vesicles of the Gram-positive gut symbiont </w:t>
-      </w:r>
-      <w:r>
-        <w:rPr>
-          <w:b w:val="0"/>
-          <w:i/>
-          <w:sz w:val="19"/>
-        </w:rPr>
-        <w:t>Bifidobacterium longum</w:t>
-      </w:r>
-      <w:r>
-        <w:rPr>
-          <w:b w:val="0"/>
-          <w:i w:val="0"/>
-          <w:sz w:val="19"/>
-        </w:rPr>
-        <w:t xml:space="preserve"> induce immune-modulatory, anti-inflammatory effects. </w:t>
-      </w:r>
-      <w:r>
-        <w:rPr>
-          <w:b w:val="0"/>
-          <w:i/>
-          <w:sz w:val="19"/>
-        </w:rPr>
-        <w:t>npj Biofilms Microbiomes</w:t>
-      </w:r>
-      <w:r>
-        <w:rPr>
-          <w:b w:val="0"/>
-          <w:i w:val="0"/>
-          <w:sz w:val="19"/>
-        </w:rPr>
-        <w:t>. 2023.</w:t>
-      </w:r>
-    </w:p>
-    <w:p>
-      <w:pPr>
-        <w:tabs>
-          <w:tab w:pos="510" w:val="left"/>
-        </w:tabs>
-        <w:spacing w:after="60"/>
-        <w:ind w:left="510" w:hanging="510"/>
-      </w:pPr>
-      <w:r>
-        <w:rPr>
-          <w:b w:val="0"/>
-          <w:i w:val="0"/>
-          <w:color w:val="555555"/>
-          <w:sz w:val="19"/>
-        </w:rPr>
-        <w:t>6.</w:t>
-        <w:tab/>
-      </w:r>
-      <w:r>
-        <w:rPr>
-          <w:b w:val="0"/>
-          <w:i w:val="0"/>
-          <w:sz w:val="19"/>
-        </w:rPr>
-        <w:t>†Mudrik-Zohar H, †</w:t>
-      </w:r>
-      <w:r>
-        <w:rPr>
-          <w:b/>
-          <w:i w:val="0"/>
-          <w:sz w:val="19"/>
-        </w:rPr>
-        <w:t>Carasso S</w:t>
-      </w:r>
-      <w:r>
-        <w:rPr>
-          <w:b w:val="0"/>
-          <w:i w:val="0"/>
-          <w:sz w:val="19"/>
-        </w:rPr>
-        <w:t xml:space="preserve">, Gefen T, Zalmanovich A, Katzir M, Cohen Y, et al. Microbiome characterization of infected diabetic foot ulcers in association with clinical outcomes: traditional cultures versus molecular sequencing methods. </w:t>
-      </w:r>
-      <w:r>
-        <w:rPr>
-          <w:b w:val="0"/>
-          <w:i/>
-          <w:sz w:val="19"/>
-        </w:rPr>
-        <w:t>Front Cell Infect Microbiol</w:t>
-      </w:r>
-      <w:r>
-        <w:rPr>
-          <w:b w:val="0"/>
-          <w:i w:val="0"/>
-          <w:sz w:val="19"/>
-        </w:rPr>
-        <w:t>. 2022.</w:t>
-      </w:r>
-    </w:p>
-    <w:p>
-      <w:pPr>
-        <w:tabs>
-          <w:tab w:pos="510" w:val="left"/>
-        </w:tabs>
-        <w:spacing w:after="60"/>
-        <w:ind w:left="510" w:hanging="510"/>
-      </w:pPr>
-      <w:r>
-        <w:rPr>
-          <w:b w:val="0"/>
-          <w:i w:val="0"/>
-          <w:color w:val="555555"/>
-          <w:sz w:val="19"/>
-        </w:rPr>
-        <w:t>5.</w:t>
-        <w:tab/>
-      </w:r>
-      <w:r>
-        <w:rPr>
-          <w:b/>
-          <w:i w:val="0"/>
-          <w:sz w:val="19"/>
-        </w:rPr>
-        <w:t>Carasso S</w:t>
-      </w:r>
-      <w:r>
-        <w:rPr>
-          <w:b w:val="0"/>
-          <w:i w:val="0"/>
-          <w:sz w:val="19"/>
-        </w:rPr>
-        <w:t xml:space="preserve">, Fishman B, Lask LS, Shochat T, Geva-Zatorsky N, Tauber E. Metagenomic analysis reveals the signature of gut microbiota associated with human chronotypes. </w:t>
-      </w:r>
-      <w:r>
-        <w:rPr>
-          <w:b w:val="0"/>
-          <w:i/>
-          <w:sz w:val="19"/>
-        </w:rPr>
-        <w:t>FASEB J</w:t>
-      </w:r>
-      <w:r>
-        <w:rPr>
-          <w:b w:val="0"/>
-          <w:i w:val="0"/>
-          <w:sz w:val="19"/>
-        </w:rPr>
-        <w:t>. 2021.</w:t>
-      </w:r>
-    </w:p>
-    <w:p>
-      <w:pPr>
-        <w:tabs>
-          <w:tab w:pos="510" w:val="left"/>
-        </w:tabs>
-        <w:spacing w:after="60"/>
-        <w:ind w:left="510" w:hanging="510"/>
-      </w:pPr>
-      <w:r>
-        <w:rPr>
-          <w:b w:val="0"/>
-          <w:i w:val="0"/>
-          <w:color w:val="555555"/>
-          <w:sz w:val="19"/>
-        </w:rPr>
-        <w:t>4.</w:t>
-        <w:tab/>
-      </w:r>
-      <w:r>
-        <w:rPr>
-          <w:b w:val="0"/>
-          <w:i w:val="0"/>
-          <w:sz w:val="19"/>
-        </w:rPr>
-        <w:t xml:space="preserve">Marai I, Carasso D, </w:t>
-      </w:r>
-      <w:r>
-        <w:rPr>
-          <w:b/>
-          <w:i w:val="0"/>
-          <w:sz w:val="19"/>
-        </w:rPr>
-        <w:t>Carasso S</w:t>
-      </w:r>
-      <w:r>
-        <w:rPr>
-          <w:b w:val="0"/>
-          <w:i w:val="0"/>
-          <w:sz w:val="19"/>
-        </w:rPr>
-        <w:t xml:space="preserve">, Carasso S. The mechanical cost of decreasing conduction velocity: a mathematical model of pacing-induced lower strain. </w:t>
-      </w:r>
-      <w:r>
-        <w:rPr>
-          <w:b w:val="0"/>
-          <w:i/>
-          <w:sz w:val="19"/>
-        </w:rPr>
-        <w:t>J Atr Fibrillation</w:t>
-      </w:r>
-      <w:r>
-        <w:rPr>
-          <w:b w:val="0"/>
-          <w:i w:val="0"/>
-          <w:sz w:val="19"/>
-        </w:rPr>
-        <w:t>. 2021.</w:t>
+        <w:t xml:space="preserve"> 2025;53(9):1326–1333.</w:t>
       </w:r>
     </w:p>
     <w:p>
@@ -1374,15 +1722,15 @@
           <w:i w:val="0"/>
           <w:sz w:val="19"/>
         </w:rPr>
-        <w:t xml:space="preserve">Berkowitz E, Kopelman Y, Kadosh D, </w:t>
+        <w:t xml:space="preserve">Marai I, Carasso D, Carasso S, Carasso S. The mechanical cost of decreasing conduction velocity: a mathematical model of pacing-induced lower strain. </w:t>
       </w:r>
       <w:r>
         <w:rPr>
-          <w:b/>
-          <w:i w:val="0"/>
+          <w:b w:val="0"/>
+          <w:i/>
           <w:sz w:val="19"/>
         </w:rPr>
-        <w:t>Carasso S</w:t>
+        <w:t>J Atr Fibrillation.</w:t>
       </w:r>
       <w:r>
         <w:rPr>
@@ -1390,223 +1738,7 @@
           <w:i w:val="0"/>
           <w:sz w:val="19"/>
         </w:rPr>
-        <w:t xml:space="preserve">, Tiosano B, Kesler A, Geva-Zatorsky N. "More guts than brains?" The role of gut microbiota in idiopathic intracranial hypertension. </w:t>
-      </w:r>
-      <w:r>
-        <w:rPr>
-          <w:b w:val="0"/>
-          <w:i/>
-          <w:sz w:val="19"/>
-        </w:rPr>
-        <w:t>J Neuroophthalmol</w:t>
-      </w:r>
-      <w:r>
-        <w:rPr>
-          <w:b w:val="0"/>
-          <w:i w:val="0"/>
-          <w:sz w:val="19"/>
-        </w:rPr>
-        <w:t>. 2021.</w:t>
-      </w:r>
-    </w:p>
-    <w:p>
-      <w:pPr>
-        <w:tabs>
-          <w:tab w:pos="510" w:val="left"/>
-        </w:tabs>
-        <w:spacing w:after="60"/>
-        <w:ind w:left="510" w:hanging="510"/>
-      </w:pPr>
-      <w:r>
-        <w:rPr>
-          <w:b w:val="0"/>
-          <w:i w:val="0"/>
-          <w:color w:val="555555"/>
-          <w:sz w:val="19"/>
-        </w:rPr>
-        <w:t>2.</w:t>
-        <w:tab/>
-      </w:r>
-      <w:r>
-        <w:rPr>
-          <w:b w:val="0"/>
-          <w:i w:val="0"/>
-          <w:sz w:val="19"/>
-        </w:rPr>
-        <w:t>†Bar-Yoseph H, †</w:t>
-      </w:r>
-      <w:r>
-        <w:rPr>
-          <w:b/>
-          <w:i w:val="0"/>
-          <w:sz w:val="19"/>
-        </w:rPr>
-        <w:t>Carasso S</w:t>
-      </w:r>
-      <w:r>
-        <w:rPr>
-          <w:b w:val="0"/>
-          <w:i w:val="0"/>
-          <w:sz w:val="19"/>
-        </w:rPr>
-        <w:t xml:space="preserve">, Shklar S, Korytny A, Even Dar R, Daoud H, et al. Oral capsulized fecal microbiota transplantation for eradication of carbapenemase-producing Enterobacteriaceae colonization with a metagenomic perspective. </w:t>
-      </w:r>
-      <w:r>
-        <w:rPr>
-          <w:b w:val="0"/>
-          <w:i/>
-          <w:sz w:val="19"/>
-        </w:rPr>
-        <w:t>Clin Infect Dis</w:t>
-      </w:r>
-      <w:r>
-        <w:rPr>
-          <w:b w:val="0"/>
-          <w:i w:val="0"/>
-          <w:sz w:val="19"/>
-        </w:rPr>
-        <w:t>. 2020.</w:t>
-      </w:r>
-    </w:p>
-    <w:p>
-      <w:pPr>
-        <w:tabs>
-          <w:tab w:pos="510" w:val="left"/>
-        </w:tabs>
-        <w:spacing w:after="60"/>
-        <w:ind w:left="510" w:hanging="510"/>
-      </w:pPr>
-      <w:r>
-        <w:rPr>
-          <w:b w:val="0"/>
-          <w:i w:val="0"/>
-          <w:color w:val="555555"/>
-          <w:sz w:val="19"/>
-        </w:rPr>
-        <w:t>1.</w:t>
-        <w:tab/>
-      </w:r>
-      <w:r>
-        <w:rPr>
-          <w:b w:val="0"/>
-          <w:i w:val="0"/>
-          <w:sz w:val="19"/>
-        </w:rPr>
-        <w:t xml:space="preserve">Ben-Assa N, Coyne MJ, Fomenkov A, Livny J, Robins WP, Muniesa M, Carey V, </w:t>
-      </w:r>
-      <w:r>
-        <w:rPr>
-          <w:b/>
-          <w:i w:val="0"/>
-          <w:sz w:val="19"/>
-        </w:rPr>
-        <w:t>Carasso S</w:t>
-      </w:r>
-      <w:r>
-        <w:rPr>
-          <w:b w:val="0"/>
-          <w:i w:val="0"/>
-          <w:sz w:val="19"/>
-        </w:rPr>
-        <w:t xml:space="preserve">, et al. Analysis of a phase-variable restriction modification system of the human gut symbiont </w:t>
-      </w:r>
-      <w:r>
-        <w:rPr>
-          <w:b w:val="0"/>
-          <w:i/>
-          <w:sz w:val="19"/>
-        </w:rPr>
-        <w:t>Bacteroides fragilis</w:t>
-      </w:r>
-      <w:r>
-        <w:rPr>
-          <w:b w:val="0"/>
-          <w:i w:val="0"/>
-          <w:sz w:val="19"/>
-        </w:rPr>
-        <w:t xml:space="preserve">. </w:t>
-      </w:r>
-      <w:r>
-        <w:rPr>
-          <w:b w:val="0"/>
-          <w:i/>
-          <w:sz w:val="19"/>
-        </w:rPr>
-        <w:t>Nucleic Acids Res</w:t>
-      </w:r>
-      <w:r>
-        <w:rPr>
-          <w:b w:val="0"/>
-          <w:i w:val="0"/>
-          <w:sz w:val="19"/>
-        </w:rPr>
-        <w:t>. 2020.</w:t>
-      </w:r>
-    </w:p>
-    <w:p>
-      <w:pPr>
-        <w:keepNext/>
-        <w:spacing w:before="80" w:after="40"/>
-      </w:pPr>
-      <w:r>
-        <w:rPr>
-          <w:b/>
-          <w:i w:val="0"/>
-          <w:color w:val="555555"/>
-          <w:sz w:val="19"/>
-        </w:rPr>
-        <w:t>Preview</w:t>
-      </w:r>
-    </w:p>
-    <w:p>
-      <w:pPr>
-        <w:tabs>
-          <w:tab w:pos="510" w:val="left"/>
-        </w:tabs>
-        <w:spacing w:after="60"/>
-        <w:ind w:left="510" w:hanging="510"/>
-      </w:pPr>
-      <w:r>
-        <w:rPr>
-          <w:b w:val="0"/>
-          <w:i w:val="0"/>
-          <w:color w:val="555555"/>
-          <w:sz w:val="19"/>
-        </w:rPr>
-        <w:t>P1.</w:t>
-        <w:tab/>
-      </w:r>
-      <w:r>
-        <w:rPr>
-          <w:b/>
-          <w:i w:val="0"/>
-          <w:sz w:val="19"/>
-        </w:rPr>
-        <w:t>Carasso S</w:t>
-      </w:r>
-      <w:r>
-        <w:rPr>
-          <w:b w:val="0"/>
-          <w:i w:val="0"/>
-          <w:sz w:val="19"/>
-        </w:rPr>
-        <w:t xml:space="preserve">, Hajjo H, Geva-Zatorsky N. Phage-bacteria associations: analyze, match, develop therapies. </w:t>
-      </w:r>
-      <w:r>
-        <w:rPr>
-          <w:b w:val="0"/>
-          <w:i/>
-          <w:sz w:val="19"/>
-        </w:rPr>
-        <w:t>Cell Host Microbe</w:t>
-      </w:r>
-      <w:r>
-        <w:rPr>
-          <w:b w:val="0"/>
-          <w:i w:val="0"/>
-          <w:sz w:val="19"/>
-        </w:rPr>
-        <w:t>. 2020.</w:t>
+        <w:t xml:space="preserve"> 2021;14(1):20200444.</w:t>
       </w:r>
     </w:p>
     <w:p>
@@ -1664,7 +1796,7 @@
           <w:i w:val="0"/>
           <w:sz w:val="19"/>
         </w:rPr>
-        <w:t>, Gefen T, Keshet R, Hajjo H, Zaatry R, Sharon I. Reversible bacterial phase-variations and uses thereof in diagnostic and therapeutic applications. WO2024176230A1, 2024.</w:t>
+        <w:t>, Gefen T, Keshet R, Hajjo H, Zaatry R, Sharon I. Reversible bacterial phase-variations and uses thereof in diagnostic and therapeutic applications. WO2024176230A1, 2024; US Patent App. 19/157,833, 2026.</w:t>
       </w:r>
     </w:p>
     <w:p>
@@ -1820,7 +1952,7 @@
                 <w:b/>
                 <w:i w:val="0"/>
               </w:rPr>
-              <w:t>Jacobs Award for an Excellent Publication (Technion)</w:t>
+              <w:t>Jacobs Award for an Excellent Publication, Technion</w:t>
             </w:r>
           </w:p>
         </w:tc>
@@ -1967,7 +2099,7 @@
                 <w:b/>
                 <w:i w:val="0"/>
               </w:rPr>
-              <w:t>Teva BioInnovation Student Fellowship &amp; Mentorship Program</w:t>
+              <w:t>Teva BioInnovation Student Fellowship and Mentorship Program</w:t>
             </w:r>
           </w:p>
         </w:tc>
@@ -1999,7 +2131,7 @@
                 <w:color w:val="555555"/>
                 <w:sz w:val="19"/>
               </w:rPr>
-              <w:t>2020 – 2024</w:t>
+              <w:t>2020–2024</w:t>
             </w:r>
           </w:p>
         </w:tc>
@@ -2048,7 +2180,7 @@
                 <w:color w:val="555555"/>
                 <w:sz w:val="19"/>
               </w:rPr>
-              <w:t>2017 – 2018</w:t>
+              <w:t>2017–2018</w:t>
             </w:r>
           </w:p>
         </w:tc>
@@ -2065,7 +2197,7 @@
                 <w:b/>
                 <w:i w:val="0"/>
               </w:rPr>
-              <w:t>Outstanding Bachelor Student Award and Dean's List (three semesters), Faculty of Biology</w:t>
+              <w:t>Outstanding Bachelor Student Award and Dean's List (three semesters), Faculty of Biology, Technion</w:t>
             </w:r>
           </w:p>
         </w:tc>
@@ -2089,65 +2221,6 @@
         <w:t>CONFERENCE PRESENTATIONS</w:t>
       </w:r>
     </w:p>
-    <w:tbl>
-      <w:tblPr>
-        <w:tblW w:type="auto" w:w="0"/>
-        <w:tblLayout w:type="fixed"/>
-        <w:tblLook w:firstColumn="1" w:firstRow="1" w:lastColumn="0" w:lastRow="0" w:noHBand="0" w:noVBand="1" w:val="04A0"/>
-      </w:tblPr>
-      <w:tblGrid>
-        <w:gridCol w:w="1871"/>
-        <w:gridCol w:w="8277"/>
-      </w:tblGrid>
-      <w:tr>
-        <w:trPr>
-          <w:cantSplit/>
-        </w:trPr>
-        <w:tc>
-          <w:tcPr>
-            <w:tcW w:type="dxa" w:w="1871"/>
-          </w:tcPr>
-          <w:p>
-            <w:r>
-              <w:rPr>
-                <w:b w:val="0"/>
-                <w:i w:val="0"/>
-                <w:color w:val="555555"/>
-                <w:sz w:val="19"/>
-              </w:rPr>
-              <w:t>2024</w:t>
-            </w:r>
-          </w:p>
-        </w:tc>
-        <w:tc>
-          <w:tcPr>
-            <w:tcW w:type="dxa" w:w="8277"/>
-          </w:tcPr>
-          <w:p>
-            <w:r>
-              <w:rPr>
-                <w:b/>
-                <w:i w:val="0"/>
-              </w:rPr>
-              <w:t>"Bacterial DNA inversions and functional plasticity during inflammation and encounter with bacteriophages"</w:t>
-            </w:r>
-          </w:p>
-          <w:p>
-            <w:pPr>
-              <w:spacing w:after="60"/>
-            </w:pPr>
-            <w:r>
-              <w:rPr>
-                <w:b w:val="0"/>
-                <w:i w:val="0"/>
-                <w:sz w:val="19"/>
-              </w:rPr>
-              <w:t>Israel Society for Microbiology Annual Meeting, Ramat Gan, Israel (poster)</w:t>
-            </w:r>
-          </w:p>
-        </w:tc>
-      </w:tr>
-    </w:tbl>
     <w:tbl>
       <w:tblPr>
         <w:tblW w:type="auto" w:w="0"/>
@@ -2216,6 +2289,65 @@
                 <w:sz w:val="19"/>
               </w:rPr>
               <w:t>10th International Human Microbiome Consortium Congress, Rome, Italy (short talk)</w:t>
+            </w:r>
+          </w:p>
+        </w:tc>
+      </w:tr>
+    </w:tbl>
+    <w:tbl>
+      <w:tblPr>
+        <w:tblW w:type="auto" w:w="0"/>
+        <w:tblLayout w:type="fixed"/>
+        <w:tblLook w:firstColumn="1" w:firstRow="1" w:lastColumn="0" w:lastRow="0" w:noHBand="0" w:noVBand="1" w:val="04A0"/>
+      </w:tblPr>
+      <w:tblGrid>
+        <w:gridCol w:w="1871"/>
+        <w:gridCol w:w="8277"/>
+      </w:tblGrid>
+      <w:tr>
+        <w:trPr>
+          <w:cantSplit/>
+        </w:trPr>
+        <w:tc>
+          <w:tcPr>
+            <w:tcW w:type="dxa" w:w="1871"/>
+          </w:tcPr>
+          <w:p>
+            <w:r>
+              <w:rPr>
+                <w:b w:val="0"/>
+                <w:i w:val="0"/>
+                <w:color w:val="555555"/>
+                <w:sz w:val="19"/>
+              </w:rPr>
+              <w:t>2024</w:t>
+            </w:r>
+          </w:p>
+        </w:tc>
+        <w:tc>
+          <w:tcPr>
+            <w:tcW w:type="dxa" w:w="8277"/>
+          </w:tcPr>
+          <w:p>
+            <w:r>
+              <w:rPr>
+                <w:b/>
+                <w:i w:val="0"/>
+              </w:rPr>
+              <w:t>"Bacterial DNA inversions and functional plasticity during inflammation and encounter with bacteriophages"</w:t>
+            </w:r>
+          </w:p>
+          <w:p>
+            <w:pPr>
+              <w:spacing w:after="60"/>
+            </w:pPr>
+            <w:r>
+              <w:rPr>
+                <w:b w:val="0"/>
+                <w:i w:val="0"/>
+                <w:sz w:val="19"/>
+              </w:rPr>
+              <w:t>Israel Society for Microbiology Annual Meeting, Ramat Gan, Israel (poster)</w:t>
             </w:r>
           </w:p>
         </w:tc>

</xml_diff>